<commit_message>
addition of the scores gauges
</commit_message>
<xml_diff>
--- a/documentation/Analyse de la consommation électrique avec les données des smart.docx
+++ b/documentation/Analyse de la consommation électrique avec les données des smart.docx
@@ -119,7 +119,7 @@
             </w:rPr>
             <w:fldChar w:fldCharType="separate"/>
           </w:r>
-          <w:hyperlink w:anchor="_Toc225237385" w:history="1">
+          <w:hyperlink w:anchor="_Toc225797004" w:history="1">
             <w:r>
               <w:rPr>
                 <w:rStyle w:val="Hyperlink"/>
@@ -163,7 +163,7 @@
                 <w:noProof/>
                 <w:webHidden/>
               </w:rPr>
-              <w:instrText xml:space="preserve"> PAGEREF _Toc225237385 \h </w:instrText>
+              <w:instrText xml:space="preserve"> PAGEREF _Toc225797004 \h </w:instrText>
             </w:r>
             <w:r>
               <w:rPr>
@@ -207,7 +207,7 @@
               <w:lang w:val="en-CH" w:eastAsia="en-CH"/>
             </w:rPr>
           </w:pPr>
-          <w:hyperlink w:anchor="_Toc225237386" w:history="1">
+          <w:hyperlink w:anchor="_Toc225797005" w:history="1">
             <w:r>
               <w:rPr>
                 <w:rStyle w:val="Hyperlink"/>
@@ -251,7 +251,7 @@
                 <w:noProof/>
                 <w:webHidden/>
               </w:rPr>
-              <w:instrText xml:space="preserve"> PAGEREF _Toc225237386 \h </w:instrText>
+              <w:instrText xml:space="preserve"> PAGEREF _Toc225797005 \h </w:instrText>
             </w:r>
             <w:r>
               <w:rPr>
@@ -295,7 +295,7 @@
               <w:lang w:val="en-CH" w:eastAsia="en-CH"/>
             </w:rPr>
           </w:pPr>
-          <w:hyperlink w:anchor="_Toc225237387" w:history="1">
+          <w:hyperlink w:anchor="_Toc225797006" w:history="1">
             <w:r>
               <w:rPr>
                 <w:rStyle w:val="Hyperlink"/>
@@ -339,7 +339,7 @@
                 <w:noProof/>
                 <w:webHidden/>
               </w:rPr>
-              <w:instrText xml:space="preserve"> PAGEREF _Toc225237387 \h </w:instrText>
+              <w:instrText xml:space="preserve"> PAGEREF _Toc225797006 \h </w:instrText>
             </w:r>
             <w:r>
               <w:rPr>
@@ -359,7 +359,7 @@
                 <w:noProof/>
                 <w:webHidden/>
               </w:rPr>
-              <w:t>8</w:t>
+              <w:t>9</w:t>
             </w:r>
             <w:r>
               <w:rPr>
@@ -378,10 +378,12 @@
               <w:tab w:val="right" w:leader="dot" w:pos="9016"/>
             </w:tabs>
             <w:rPr>
+              <w:rFonts w:eastAsiaTheme="minorEastAsia"/>
               <w:noProof/>
+              <w:lang w:val="en-CH" w:eastAsia="en-CH"/>
             </w:rPr>
           </w:pPr>
-          <w:hyperlink w:anchor="_Toc225237388" w:history="1">
+          <w:hyperlink w:anchor="_Toc225797007" w:history="1">
             <w:r>
               <w:rPr>
                 <w:rStyle w:val="Hyperlink"/>
@@ -392,7 +394,9 @@
             </w:r>
             <w:r>
               <w:rPr>
+                <w:rFonts w:eastAsiaTheme="minorEastAsia"/>
                 <w:noProof/>
+                <w:lang w:val="en-CH" w:eastAsia="en-CH"/>
               </w:rPr>
               <w:tab/>
             </w:r>
@@ -423,7 +427,7 @@
                 <w:noProof/>
                 <w:webHidden/>
               </w:rPr>
-              <w:instrText xml:space="preserve"> PAGEREF _Toc225237388 \h </w:instrText>
+              <w:instrText xml:space="preserve"> PAGEREF _Toc225797007 \h </w:instrText>
             </w:r>
             <w:r>
               <w:rPr>
@@ -443,7 +447,95 @@
                 <w:noProof/>
                 <w:webHidden/>
               </w:rPr>
-              <w:t>9</w:t>
+              <w:t>10</w:t>
+            </w:r>
+            <w:r>
+              <w:rPr>
+                <w:noProof/>
+                <w:webHidden/>
+              </w:rPr>
+              <w:fldChar w:fldCharType="end"/>
+            </w:r>
+          </w:hyperlink>
+        </w:p>
+        <w:p>
+          <w:pPr>
+            <w:pStyle w:val="TOC2"/>
+            <w:tabs>
+              <w:tab w:val="left" w:pos="960"/>
+              <w:tab w:val="right" w:leader="dot" w:pos="9016"/>
+            </w:tabs>
+            <w:rPr>
+              <w:rFonts w:eastAsiaTheme="minorEastAsia"/>
+              <w:noProof/>
+              <w:lang w:val="en-CH" w:eastAsia="en-CH"/>
+            </w:rPr>
+          </w:pPr>
+          <w:hyperlink w:anchor="_Toc225797008" w:history="1">
+            <w:r>
+              <w:rPr>
+                <w:rStyle w:val="Hyperlink"/>
+                <w:noProof/>
+                <w:lang w:val="fr-CH"/>
+              </w:rPr>
+              <w:t>3.2</w:t>
+            </w:r>
+            <w:r>
+              <w:rPr>
+                <w:rFonts w:eastAsiaTheme="minorEastAsia"/>
+                <w:noProof/>
+                <w:lang w:val="en-CH" w:eastAsia="en-CH"/>
+              </w:rPr>
+              <w:tab/>
+            </w:r>
+            <w:r>
+              <w:rPr>
+                <w:rStyle w:val="Hyperlink"/>
+                <w:noProof/>
+                <w:lang w:val="fr-CH"/>
+              </w:rPr>
+              <w:t>Exemple Perlas</w:t>
+            </w:r>
+            <w:r>
+              <w:rPr>
+                <w:noProof/>
+                <w:webHidden/>
+              </w:rPr>
+              <w:tab/>
+            </w:r>
+            <w:r>
+              <w:rPr>
+                <w:noProof/>
+                <w:webHidden/>
+              </w:rPr>
+              <w:fldChar w:fldCharType="begin"/>
+            </w:r>
+            <w:r>
+              <w:rPr>
+                <w:noProof/>
+                <w:webHidden/>
+              </w:rPr>
+              <w:instrText xml:space="preserve"> PAGEREF _Toc225797008 \h </w:instrText>
+            </w:r>
+            <w:r>
+              <w:rPr>
+                <w:noProof/>
+                <w:webHidden/>
+              </w:rPr>
+            </w:r>
+            <w:r>
+              <w:rPr>
+                <w:noProof/>
+                <w:webHidden/>
+              </w:rPr>
+              <w:fldChar w:fldCharType="separate"/>
+            </w:r>
+            <w:r>
+              <w:rPr>
+                <w:noProof/>
+                <w:webHidden/>
+              </w:rPr>
+              <w:t>14</w:t>
             </w:r>
             <w:r>
               <w:rPr>
@@ -467,7 +559,7 @@
               <w:lang w:val="en-CH" w:eastAsia="en-CH"/>
             </w:rPr>
           </w:pPr>
-          <w:hyperlink w:anchor="_Toc225237389" w:history="1">
+          <w:hyperlink w:anchor="_Toc225797009" w:history="1">
             <w:r>
               <w:rPr>
                 <w:rStyle w:val="Hyperlink"/>
@@ -511,7 +603,7 @@
                 <w:noProof/>
                 <w:webHidden/>
               </w:rPr>
-              <w:instrText xml:space="preserve"> PAGEREF _Toc225237389 \h </w:instrText>
+              <w:instrText xml:space="preserve"> PAGEREF _Toc225797009 \h </w:instrText>
             </w:r>
             <w:r>
               <w:rPr>
@@ -531,7 +623,7 @@
                 <w:noProof/>
                 <w:webHidden/>
               </w:rPr>
-              <w:t>13</w:t>
+              <w:t>15</w:t>
             </w:r>
             <w:r>
               <w:rPr>
@@ -555,7 +647,7 @@
               <w:lang w:val="en-CH" w:eastAsia="en-CH"/>
             </w:rPr>
           </w:pPr>
-          <w:hyperlink w:anchor="_Toc225237390" w:history="1">
+          <w:hyperlink w:anchor="_Toc225797010" w:history="1">
             <w:r>
               <w:rPr>
                 <w:rStyle w:val="Hyperlink"/>
@@ -599,7 +691,7 @@
                 <w:noProof/>
                 <w:webHidden/>
               </w:rPr>
-              <w:instrText xml:space="preserve"> PAGEREF _Toc225237390 \h </w:instrText>
+              <w:instrText xml:space="preserve"> PAGEREF _Toc225797010 \h </w:instrText>
             </w:r>
             <w:r>
               <w:rPr>
@@ -619,7 +711,7 @@
                 <w:noProof/>
                 <w:webHidden/>
               </w:rPr>
-              <w:t>13</w:t>
+              <w:t>16</w:t>
             </w:r>
             <w:r>
               <w:rPr>
@@ -689,9 +781,9 @@
           <w:lang w:val="fr-CH"/>
         </w:rPr>
         <w:drawing>
-          <wp:inline distT="0" distB="0" distL="0" distR="0" wp14:anchorId="6BADD507" wp14:editId="06D266B5">
-            <wp:extent cx="4394177" cy="3195765"/>
-            <wp:effectExtent l="0" t="0" r="6985" b="5080"/>
+          <wp:inline distT="0" distB="0" distL="0" distR="0" wp14:anchorId="6BADD507" wp14:editId="4511421C">
+            <wp:extent cx="5035747" cy="3662362"/>
+            <wp:effectExtent l="0" t="0" r="0" b="0"/>
             <wp:docPr id="10" name="Picture 9" descr="image.png"/>
             <wp:cNvGraphicFramePr>
               <a:graphicFrameLocks xmlns:a="http://schemas.openxmlformats.org/drawingml/2006/main" noChangeAspect="1"/>
@@ -714,7 +806,7 @@
                   <pic:spPr>
                     <a:xfrm>
                       <a:off x="0" y="0"/>
-                      <a:ext cx="4394177" cy="3195765"/>
+                      <a:ext cx="5045993" cy="3669814"/>
                     </a:xfrm>
                     <a:prstGeom prst="rect">
                       <a:avLst/>
@@ -747,7 +839,7 @@
           <w:lang w:val="fr-CH"/>
         </w:rPr>
       </w:pPr>
-      <w:bookmarkStart w:id="0" w:name="_Toc225237385"/>
+      <w:bookmarkStart w:id="0" w:name="_Toc225797004"/>
       <w:r>
         <w:rPr>
           <w:lang w:val="fr-CH"/>
@@ -787,7 +879,19 @@
         <w:rPr>
           <w:lang w:val="fr-CH"/>
         </w:rPr>
-        <w:t> : la consommation doit être au maximum durant la journée durant les heures de soleil.</w:t>
+        <w:t xml:space="preserve"> : la consommation doit être </w:t>
+      </w:r>
+      <w:r>
+        <w:rPr>
+          <w:lang w:val="fr-CH"/>
+        </w:rPr>
+        <w:t xml:space="preserve">décalée </w:t>
+      </w:r>
+      <w:r>
+        <w:rPr>
+          <w:lang w:val="fr-CH"/>
+        </w:rPr>
+        <w:t>au maximum durant la journée durant les heures de soleil.</w:t>
       </w:r>
       <w:r>
         <w:rPr>
@@ -799,7 +903,19 @@
         <w:rPr>
           <w:lang w:val="fr-CH"/>
         </w:rPr>
-        <w:t>charge et solaire</w:t>
+        <w:t xml:space="preserve">charge et </w:t>
+      </w:r>
+      <w:r>
+        <w:rPr>
+          <w:lang w:val="fr-CH"/>
+        </w:rPr>
+        <w:t xml:space="preserve">présence du </w:t>
+      </w:r>
+      <w:r>
+        <w:rPr>
+          <w:lang w:val="fr-CH"/>
+        </w:rPr>
+        <w:t>solaire</w:t>
       </w:r>
       <w:r>
         <w:rPr>
@@ -818,16 +934,32 @@
         <w:rPr>
           <w:lang w:val="fr-CH"/>
         </w:rPr>
-        <w:t xml:space="preserve">Plus le score est bas, plus il y a de </w:t>
-      </w:r>
-      <w:proofErr w:type="spellStart"/>
-      <w:r>
-        <w:rPr>
-          <w:lang w:val="fr-CH"/>
-        </w:rPr>
-        <w:t>potential</w:t>
-      </w:r>
-      <w:proofErr w:type="spellEnd"/>
+        <w:t>Avec un</w:t>
+      </w:r>
+      <w:r>
+        <w:rPr>
+          <w:lang w:val="fr-CH"/>
+        </w:rPr>
+        <w:t xml:space="preserve"> score bas, il y a d</w:t>
+      </w:r>
+      <w:r>
+        <w:rPr>
+          <w:lang w:val="fr-CH"/>
+        </w:rPr>
+        <w:t>u</w:t>
+      </w:r>
+      <w:r>
+        <w:rPr>
+          <w:lang w:val="fr-CH"/>
+        </w:rPr>
+        <w:t xml:space="preserve"> </w:t>
+      </w:r>
+      <w:r>
+        <w:rPr>
+          <w:lang w:val="fr-CH"/>
+        </w:rPr>
+        <w:t>potentiel</w:t>
+      </w:r>
       <w:r>
         <w:rPr>
           <w:lang w:val="fr-CH"/>
@@ -960,7 +1092,7 @@
           <w:lang w:val="fr-CH"/>
         </w:rPr>
         <w:drawing>
-          <wp:inline distT="0" distB="0" distL="0" distR="0" wp14:anchorId="39A9000E" wp14:editId="09009333">
+          <wp:inline distT="0" distB="0" distL="0" distR="0" wp14:anchorId="39A9000E" wp14:editId="25FE708F">
             <wp:extent cx="4842888" cy="3038475"/>
             <wp:effectExtent l="0" t="0" r="0" b="0"/>
             <wp:docPr id="1066904765" name="Picture 4" descr="0"/>
@@ -1035,7 +1167,7 @@
         </w:rPr>
         <w:lastRenderedPageBreak/>
         <w:drawing>
-          <wp:inline distT="0" distB="0" distL="0" distR="0" wp14:anchorId="5F0DAA80" wp14:editId="3DC6A6FA">
+          <wp:inline distT="0" distB="0" distL="0" distR="0" wp14:anchorId="5F0DAA80" wp14:editId="1E8D18D5">
             <wp:extent cx="5731510" cy="3650615"/>
             <wp:effectExtent l="0" t="0" r="2540" b="6985"/>
             <wp:docPr id="624242601" name="Picture 3" descr="0"/>
@@ -1109,7 +1241,7 @@
           <w:lang w:val="fr-CH"/>
         </w:rPr>
         <w:drawing>
-          <wp:inline distT="0" distB="0" distL="0" distR="0" wp14:anchorId="3F165297" wp14:editId="3B76206C">
+          <wp:inline distT="0" distB="0" distL="0" distR="0" wp14:anchorId="3F165297" wp14:editId="09871714">
             <wp:extent cx="5591175" cy="3650615"/>
             <wp:effectExtent l="0" t="0" r="9525" b="6985"/>
             <wp:docPr id="734220527" name="Picture 2" descr="0"/>
@@ -1204,14 +1336,13 @@
       <w:r>
         <w:rPr>
           <w:noProof/>
-          <w:lang w:val="fr-CH"/>
         </w:rPr>
         <w:lastRenderedPageBreak/>
         <w:drawing>
-          <wp:inline distT="0" distB="0" distL="0" distR="0" wp14:anchorId="6409AAAF" wp14:editId="61E5F854">
-            <wp:extent cx="2228866" cy="1123958"/>
-            <wp:effectExtent l="0" t="0" r="0" b="0"/>
-            <wp:docPr id="29967517" name="Picture 1"/>
+          <wp:inline distT="0" distB="0" distL="0" distR="0" wp14:anchorId="32953B87" wp14:editId="6EED2CF1">
+            <wp:extent cx="3026410" cy="1674149"/>
+            <wp:effectExtent l="0" t="0" r="2540" b="2540"/>
+            <wp:docPr id="2048850815" name="Picture 2" descr="0"/>
             <wp:cNvGraphicFramePr>
               <a:graphicFrameLocks xmlns:a="http://schemas.openxmlformats.org/drawingml/2006/main" noChangeAspect="1"/>
             </wp:cNvGraphicFramePr>
@@ -1219,23 +1350,36 @@
               <a:graphicData uri="http://schemas.openxmlformats.org/drawingml/2006/picture">
                 <pic:pic xmlns:pic="http://schemas.openxmlformats.org/drawingml/2006/picture">
                   <pic:nvPicPr>
-                    <pic:cNvPr id="29967517" name=""/>
-                    <pic:cNvPicPr/>
+                    <pic:cNvPr id="0" name="Picture 3" descr="0"/>
+                    <pic:cNvPicPr>
+                      <a:picLocks noChangeAspect="1" noChangeArrowheads="1"/>
+                    </pic:cNvPicPr>
                   </pic:nvPicPr>
                   <pic:blipFill>
-                    <a:blip r:embed="rId13"/>
+                    <a:blip r:embed="rId13" cstate="print">
+                      <a:extLst>
+                        <a:ext uri="{28A0092B-C50C-407E-A947-70E740481C1C}">
+                          <a14:useLocalDpi xmlns:a14="http://schemas.microsoft.com/office/drawing/2010/main" val="0"/>
+                        </a:ext>
+                      </a:extLst>
+                    </a:blip>
+                    <a:srcRect/>
                     <a:stretch>
                       <a:fillRect/>
                     </a:stretch>
                   </pic:blipFill>
-                  <pic:spPr>
+                  <pic:spPr bwMode="auto">
                     <a:xfrm>
                       <a:off x="0" y="0"/>
-                      <a:ext cx="2228866" cy="1123958"/>
+                      <a:ext cx="3037896" cy="1680503"/>
                     </a:xfrm>
                     <a:prstGeom prst="rect">
                       <a:avLst/>
                     </a:prstGeom>
+                    <a:noFill/>
+                    <a:ln>
+                      <a:noFill/>
+                    </a:ln>
                   </pic:spPr>
                 </pic:pic>
               </a:graphicData>
@@ -1266,37 +1410,25 @@
         <w:rPr>
           <w:lang w:val="fr-CH"/>
         </w:rPr>
-        <w:t xml:space="preserve"> il est possible d’avoir un masque général plutôt moyen (par exemple </w:t>
-      </w:r>
-      <w:r>
-        <w:rPr>
-          <w:lang w:val="fr-CH"/>
-        </w:rPr>
-        <w:t>5-</w:t>
-      </w:r>
-      <w:r>
-        <w:rPr>
-          <w:lang w:val="fr-CH"/>
-        </w:rPr>
-        <w:t>10</w:t>
-      </w:r>
-      <w:r>
-        <w:rPr>
-          <w:lang w:val="fr-CH"/>
-        </w:rPr>
-        <w:t>°</w:t>
-      </w:r>
-      <w:r>
-        <w:rPr>
-          <w:lang w:val="fr-CH"/>
-        </w:rPr>
-        <w:t xml:space="preserve"> de hauteur</w:t>
-      </w:r>
-      <w:r>
-        <w:rPr>
-          <w:lang w:val="fr-CH"/>
-        </w:rPr>
-        <w:t xml:space="preserve"> plat</w:t>
+        <w:t xml:space="preserve"> il est possible d’avoir un masque général plutôt moyen</w:t>
+      </w:r>
+      <w:r>
+        <w:rPr>
+          <w:lang w:val="fr-CH"/>
+        </w:rPr>
+        <w:t xml:space="preserve"> </w:t>
+      </w:r>
+      <w:r>
+        <w:rPr>
+          <w:lang w:val="fr-CH"/>
+        </w:rPr>
+        <w:t>(par exemple</w:t>
+      </w:r>
+      <w:r>
+        <w:rPr>
+          <w:lang w:val="fr-CH"/>
+        </w:rPr>
+        <w:t xml:space="preserve"> simplement les heures d’éphémérides</w:t>
       </w:r>
       <w:r>
         <w:rPr>
@@ -1399,6 +1531,97 @@
     </w:p>
     <w:p>
       <w:pPr>
+        <w:pStyle w:val="ListParagraph"/>
+        <w:numPr>
+          <w:ilvl w:val="0"/>
+          <w:numId w:val="3"/>
+        </w:numPr>
+        <w:rPr>
+          <w:lang w:val="fr-CH"/>
+        </w:rPr>
+      </w:pPr>
+      <w:r>
+        <w:rPr>
+          <w:lang w:val="fr-CH"/>
+        </w:rPr>
+        <w:t>Il y a un peu de solaire diffus matin et soir.</w:t>
+      </w:r>
+    </w:p>
+    <w:p>
+      <w:pPr>
+        <w:rPr>
+          <w:lang w:val="fr-CH"/>
+        </w:rPr>
+      </w:pPr>
+      <w:r>
+        <w:rPr>
+          <w:lang w:val="fr-CH"/>
+        </w:rPr>
+        <w:t xml:space="preserve">Cela élargi les plages de temps </w:t>
+      </w:r>
+    </w:p>
+    <w:p>
+      <w:pPr>
+        <w:rPr>
+          <w:lang w:val="fr-CH"/>
+        </w:rPr>
+      </w:pPr>
+      <w:r>
+        <w:rPr>
+          <w:noProof/>
+        </w:rPr>
+        <w:drawing>
+          <wp:inline distT="0" distB="0" distL="0" distR="0" wp14:anchorId="5752A0A6" wp14:editId="4C39BECF">
+            <wp:extent cx="5731510" cy="3596005"/>
+            <wp:effectExtent l="0" t="0" r="2540" b="4445"/>
+            <wp:docPr id="874662252" name="Picture 1" descr="0"/>
+            <wp:cNvGraphicFramePr>
+              <a:graphicFrameLocks xmlns:a="http://schemas.openxmlformats.org/drawingml/2006/main" noChangeAspect="1"/>
+            </wp:cNvGraphicFramePr>
+            <a:graphic xmlns:a="http://schemas.openxmlformats.org/drawingml/2006/main">
+              <a:graphicData uri="http://schemas.openxmlformats.org/drawingml/2006/picture">
+                <pic:pic xmlns:pic="http://schemas.openxmlformats.org/drawingml/2006/picture">
+                  <pic:nvPicPr>
+                    <pic:cNvPr id="0" name="Picture 1" descr="0"/>
+                    <pic:cNvPicPr>
+                      <a:picLocks noChangeAspect="1" noChangeArrowheads="1"/>
+                    </pic:cNvPicPr>
+                  </pic:nvPicPr>
+                  <pic:blipFill>
+                    <a:blip r:embed="rId14" cstate="print">
+                      <a:extLst>
+                        <a:ext uri="{28A0092B-C50C-407E-A947-70E740481C1C}">
+                          <a14:useLocalDpi xmlns:a14="http://schemas.microsoft.com/office/drawing/2010/main" val="0"/>
+                        </a:ext>
+                      </a:extLst>
+                    </a:blip>
+                    <a:srcRect/>
+                    <a:stretch>
+                      <a:fillRect/>
+                    </a:stretch>
+                  </pic:blipFill>
+                  <pic:spPr bwMode="auto">
+                    <a:xfrm>
+                      <a:off x="0" y="0"/>
+                      <a:ext cx="5731510" cy="3596005"/>
+                    </a:xfrm>
+                    <a:prstGeom prst="rect">
+                      <a:avLst/>
+                    </a:prstGeom>
+                    <a:noFill/>
+                    <a:ln>
+                      <a:noFill/>
+                    </a:ln>
+                  </pic:spPr>
+                </pic:pic>
+              </a:graphicData>
+            </a:graphic>
+          </wp:inline>
+        </w:drawing>
+      </w:r>
+    </w:p>
+    <w:p>
+      <w:pPr>
         <w:rPr>
           <w:lang w:val="fr-CH"/>
         </w:rPr>
@@ -1417,7 +1640,7 @@
           <w:lang w:val="fr-CH"/>
         </w:rPr>
       </w:pPr>
-      <w:bookmarkStart w:id="1" w:name="_Toc225237386"/>
+      <w:bookmarkStart w:id="1" w:name="_Toc225797005"/>
       <w:r>
         <w:rPr>
           <w:lang w:val="fr-CH"/>
@@ -1500,7 +1723,7 @@
                     <pic:cNvPicPr/>
                   </pic:nvPicPr>
                   <pic:blipFill>
-                    <a:blip r:embed="rId14"/>
+                    <a:blip r:embed="rId15"/>
                     <a:stretch>
                       <a:fillRect/>
                     </a:stretch>
@@ -1561,7 +1784,7 @@
                     <pic:cNvPicPr/>
                   </pic:nvPicPr>
                   <pic:blipFill>
-                    <a:blip r:embed="rId15"/>
+                    <a:blip r:embed="rId16"/>
                     <a:stretch>
                       <a:fillRect/>
                     </a:stretch>
@@ -1636,7 +1859,7 @@
                     <pic:cNvPicPr/>
                   </pic:nvPicPr>
                   <pic:blipFill>
-                    <a:blip r:embed="rId16"/>
+                    <a:blip r:embed="rId17"/>
                     <a:stretch>
                       <a:fillRect/>
                     </a:stretch>
@@ -1684,7 +1907,7 @@
                     <pic:cNvPicPr/>
                   </pic:nvPicPr>
                   <pic:blipFill>
-                    <a:blip r:embed="rId17"/>
+                    <a:blip r:embed="rId18"/>
                     <a:stretch>
                       <a:fillRect/>
                     </a:stretch>
@@ -1717,14 +1940,12 @@
         </w:rPr>
         <w:t xml:space="preserve">(note: c’est un </w:t>
       </w:r>
-      <w:proofErr w:type="spellStart"/>
-      <w:r>
-        <w:rPr>
-          <w:lang w:val="fr-CH"/>
-        </w:rPr>
-        <w:t>hazard</w:t>
-      </w:r>
-      <w:proofErr w:type="spellEnd"/>
+      <w:r>
+        <w:rPr>
+          <w:lang w:val="fr-CH"/>
+        </w:rPr>
+        <w:t>hasard</w:t>
+      </w:r>
       <w:r>
         <w:rPr>
           <w:lang w:val="fr-CH"/>
@@ -1996,7 +2217,7 @@
                     <pic:cNvPicPr/>
                   </pic:nvPicPr>
                   <pic:blipFill>
-                    <a:blip r:embed="rId18"/>
+                    <a:blip r:embed="rId19"/>
                     <a:stretch>
                       <a:fillRect/>
                     </a:stretch>
@@ -2041,13 +2262,6 @@
           <w:lang w:val="fr-CH"/>
         </w:rPr>
       </w:pPr>
-    </w:p>
-    <w:p>
-      <w:pPr>
-        <w:rPr>
-          <w:lang w:val="fr-CH"/>
-        </w:rPr>
-      </w:pPr>
       <w:r>
         <w:rPr>
           <w:lang w:val="fr-CH"/>
@@ -2082,7 +2296,19 @@
         <w:rPr>
           <w:lang w:val="fr-CH"/>
         </w:rPr>
-        <w:t xml:space="preserve"> pour donner un score simple :</w:t>
+        <w:t xml:space="preserve"> pour donner un</w:t>
+      </w:r>
+      <w:r>
+        <w:rPr>
+          <w:lang w:val="fr-CH"/>
+        </w:rPr>
+        <w:t xml:space="preserve">e classification </w:t>
+      </w:r>
+      <w:r>
+        <w:rPr>
+          <w:lang w:val="fr-CH"/>
+        </w:rPr>
+        <w:t>simple :</w:t>
       </w:r>
     </w:p>
     <w:tbl>
@@ -2327,6 +2553,402 @@
         <w:rPr>
           <w:lang w:val="fr-CH"/>
         </w:rPr>
+        <w:t xml:space="preserve">Pour avoir un score de 0 à 100% avec un grand chiffre représentant le bon score il faut inverser et </w:t>
+      </w:r>
+      <w:proofErr w:type="spellStart"/>
+      <w:r>
+        <w:rPr>
+          <w:lang w:val="fr-CH"/>
+        </w:rPr>
+        <w:t>scaler</w:t>
+      </w:r>
+      <w:proofErr w:type="spellEnd"/>
+      <w:r>
+        <w:rPr>
+          <w:lang w:val="fr-CH"/>
+        </w:rPr>
+        <w:t xml:space="preserve"> : </w:t>
+      </w:r>
+      <w:r>
+        <w:rPr>
+          <w:lang w:val="fr-CH"/>
+        </w:rPr>
+        <w:t xml:space="preserve"> prendre la part « </w:t>
+      </w:r>
+      <w:proofErr w:type="spellStart"/>
+      <w:r>
+        <w:rPr>
+          <w:lang w:val="fr-CH"/>
+        </w:rPr>
+        <w:t>rest</w:t>
+      </w:r>
+      <w:proofErr w:type="spellEnd"/>
+      <w:r>
+        <w:rPr>
+          <w:lang w:val="fr-CH"/>
+        </w:rPr>
+        <w:t xml:space="preserve"> of </w:t>
+      </w:r>
+      <w:proofErr w:type="spellStart"/>
+      <w:r>
+        <w:rPr>
+          <w:lang w:val="fr-CH"/>
+        </w:rPr>
+        <w:t>consumption</w:t>
+      </w:r>
+      <w:proofErr w:type="spellEnd"/>
+      <w:r>
+        <w:rPr>
+          <w:lang w:val="fr-CH"/>
+        </w:rPr>
+        <w:t xml:space="preserve"> » et passer dans une fonction comme : </w:t>
+      </w:r>
+    </w:p>
+    <w:p>
+      <w:pPr>
+        <w:rPr>
+          <w:lang w:val="fr-FR"/>
+        </w:rPr>
+      </w:pPr>
+      <w:r>
+        <w:rPr>
+          <w:lang w:val="fr-CH"/>
+        </w:rPr>
+        <w:lastRenderedPageBreak/>
+        <w:drawing>
+          <wp:inline distT="0" distB="0" distL="0" distR="0" wp14:anchorId="1064D1FC" wp14:editId="1B2215E0">
+            <wp:extent cx="5731510" cy="2633345"/>
+            <wp:effectExtent l="0" t="0" r="2540" b="0"/>
+            <wp:docPr id="699021236" name="Picture 1" descr="The image displays a graph with a downward-sloping curve, illustrating a negative correlation between two variables, and includes a chart title and specific data points plotted on the X and Y axes.&#10;&#10;AI-generated content may be incorrect."/>
+            <wp:cNvGraphicFramePr>
+              <a:graphicFrameLocks xmlns:a="http://schemas.openxmlformats.org/drawingml/2006/main" noChangeAspect="1"/>
+            </wp:cNvGraphicFramePr>
+            <a:graphic xmlns:a="http://schemas.openxmlformats.org/drawingml/2006/main">
+              <a:graphicData uri="http://schemas.openxmlformats.org/drawingml/2006/picture">
+                <pic:pic xmlns:pic="http://schemas.openxmlformats.org/drawingml/2006/picture">
+                  <pic:nvPicPr>
+                    <pic:cNvPr id="699021236" name="Picture 1" descr="The image displays a graph with a downward-sloping curve, illustrating a negative correlation between two variables, and includes a chart title and specific data points plotted on the X and Y axes.&#10;&#10;AI-generated content may be incorrect."/>
+                    <pic:cNvPicPr/>
+                  </pic:nvPicPr>
+                  <pic:blipFill>
+                    <a:blip r:embed="rId20"/>
+                    <a:stretch>
+                      <a:fillRect/>
+                    </a:stretch>
+                  </pic:blipFill>
+                  <pic:spPr>
+                    <a:xfrm>
+                      <a:off x="0" y="0"/>
+                      <a:ext cx="5731510" cy="2633345"/>
+                    </a:xfrm>
+                    <a:prstGeom prst="rect">
+                      <a:avLst/>
+                    </a:prstGeom>
+                  </pic:spPr>
+                </pic:pic>
+              </a:graphicData>
+            </a:graphic>
+          </wp:inline>
+        </w:drawing>
+      </w:r>
+      <w:proofErr w:type="gramStart"/>
+      <w:r>
+        <w:rPr>
+          <w:lang w:val="fr-CH"/>
+        </w:rPr>
+        <w:t xml:space="preserve">L’équation  </w:t>
+      </w:r>
+      <w:r>
+        <w:rPr>
+          <w:lang w:val="fr-FR"/>
+        </w:rPr>
+        <w:t>y</w:t>
+      </w:r>
+      <w:proofErr w:type="gramEnd"/>
+      <w:r>
+        <w:rPr>
+          <w:lang w:val="fr-FR"/>
+        </w:rPr>
+        <w:t xml:space="preserve"> = 172.62x</w:t>
+      </w:r>
+      <w:r>
+        <w:rPr>
+          <w:vertAlign w:val="superscript"/>
+          <w:lang w:val="fr-FR"/>
+        </w:rPr>
+        <w:t>3</w:t>
+      </w:r>
+      <w:r>
+        <w:rPr>
+          <w:lang w:val="fr-FR"/>
+        </w:rPr>
+        <w:t xml:space="preserve"> - 124.03x</w:t>
+      </w:r>
+      <w:r>
+        <w:rPr>
+          <w:vertAlign w:val="superscript"/>
+          <w:lang w:val="fr-FR"/>
+        </w:rPr>
+        <w:t>2</w:t>
+      </w:r>
+      <w:r>
+        <w:rPr>
+          <w:lang w:val="fr-FR"/>
+        </w:rPr>
+        <w:t xml:space="preserve"> + 52.403x</w:t>
+      </w:r>
+      <w:r>
+        <w:rPr>
+          <w:lang w:val="fr-FR"/>
+        </w:rPr>
+        <w:t xml:space="preserve"> </w:t>
+      </w:r>
+      <w:r>
+        <w:rPr>
+          <w:lang w:val="fr-FR"/>
+        </w:rPr>
+        <w:t>sera utilisée</w:t>
+      </w:r>
+    </w:p>
+    <w:p>
+      <w:pPr>
+        <w:rPr>
+          <w:i/>
+          <w:iCs/>
+          <w:lang w:val="en-CH"/>
+        </w:rPr>
+      </w:pPr>
+      <w:r>
+        <w:rPr>
+          <w:i/>
+          <w:iCs/>
+          <w:lang w:val="en-CH"/>
+        </w:rPr>
+        <w:t xml:space="preserve">Score de </w:t>
+      </w:r>
+      <w:proofErr w:type="spellStart"/>
+      <w:r>
+        <w:rPr>
+          <w:i/>
+          <w:iCs/>
+          <w:lang w:val="en-CH"/>
+        </w:rPr>
+        <w:t>ruban</w:t>
+      </w:r>
+      <w:proofErr w:type="spellEnd"/>
+      <w:r>
+        <w:rPr>
+          <w:i/>
+          <w:iCs/>
+          <w:lang w:val="en-CH"/>
+        </w:rPr>
+        <w:t xml:space="preserve"> du </w:t>
+      </w:r>
+      <w:proofErr w:type="spellStart"/>
+      <w:r>
+        <w:rPr>
+          <w:i/>
+          <w:iCs/>
+          <w:lang w:val="en-CH"/>
+        </w:rPr>
+        <w:t>profil</w:t>
+      </w:r>
+      <w:proofErr w:type="spellEnd"/>
+      <w:r>
+        <w:rPr>
+          <w:i/>
+          <w:iCs/>
+          <w:lang w:val="en-CH"/>
+        </w:rPr>
+        <w:t xml:space="preserve"> de </w:t>
+      </w:r>
+      <w:proofErr w:type="spellStart"/>
+      <w:r>
+        <w:rPr>
+          <w:i/>
+          <w:iCs/>
+          <w:lang w:val="en-CH"/>
+        </w:rPr>
+        <w:t>consommation</w:t>
+      </w:r>
+      <w:proofErr w:type="spellEnd"/>
+      <w:r>
+        <w:rPr>
+          <w:i/>
+          <w:iCs/>
+          <w:lang w:val="en-CH"/>
+        </w:rPr>
+        <w:t xml:space="preserve">: 91.1%, </w:t>
+      </w:r>
+      <w:proofErr w:type="spellStart"/>
+      <w:r>
+        <w:rPr>
+          <w:i/>
+          <w:iCs/>
+          <w:lang w:val="en-CH"/>
+        </w:rPr>
+        <w:t>basé</w:t>
+      </w:r>
+      <w:proofErr w:type="spellEnd"/>
+      <w:r>
+        <w:rPr>
+          <w:i/>
+          <w:iCs/>
+          <w:lang w:val="en-CH"/>
+        </w:rPr>
+        <w:t xml:space="preserve"> sur </w:t>
+      </w:r>
+      <w:proofErr w:type="spellStart"/>
+      <w:r>
+        <w:rPr>
+          <w:i/>
+          <w:iCs/>
+          <w:lang w:val="en-CH"/>
+        </w:rPr>
+        <w:t>une</w:t>
+      </w:r>
+      <w:proofErr w:type="spellEnd"/>
+      <w:r>
+        <w:rPr>
+          <w:i/>
+          <w:iCs/>
+          <w:lang w:val="en-CH"/>
+        </w:rPr>
+        <w:t xml:space="preserve"> fraction de </w:t>
+      </w:r>
+      <w:proofErr w:type="spellStart"/>
+      <w:r>
+        <w:rPr>
+          <w:i/>
+          <w:iCs/>
+          <w:lang w:val="en-CH"/>
+        </w:rPr>
+        <w:t>ruban</w:t>
+      </w:r>
+      <w:proofErr w:type="spellEnd"/>
+      <w:r>
+        <w:rPr>
+          <w:i/>
+          <w:iCs/>
+          <w:lang w:val="en-CH"/>
+        </w:rPr>
+        <w:t xml:space="preserve"> de 3.2 % pour un </w:t>
+      </w:r>
+      <w:proofErr w:type="spellStart"/>
+      <w:r>
+        <w:rPr>
+          <w:i/>
+          <w:iCs/>
+          <w:lang w:val="en-CH"/>
+        </w:rPr>
+        <w:t>niveau</w:t>
+      </w:r>
+      <w:proofErr w:type="spellEnd"/>
+      <w:r>
+        <w:rPr>
+          <w:i/>
+          <w:iCs/>
+          <w:lang w:val="en-CH"/>
+        </w:rPr>
+        <w:t xml:space="preserve"> de </w:t>
+      </w:r>
+      <w:proofErr w:type="spellStart"/>
+      <w:r>
+        <w:rPr>
+          <w:i/>
+          <w:iCs/>
+          <w:lang w:val="en-CH"/>
+        </w:rPr>
+        <w:t>ruban</w:t>
+      </w:r>
+      <w:proofErr w:type="spellEnd"/>
+      <w:r>
+        <w:rPr>
+          <w:i/>
+          <w:iCs/>
+          <w:lang w:val="en-CH"/>
+        </w:rPr>
+        <w:t xml:space="preserve"> de 0.0 kW</w:t>
+      </w:r>
+    </w:p>
+    <w:p>
+      <w:pPr>
+        <w:jc w:val="center"/>
+        <w:rPr>
+          <w:lang w:val="en-CH"/>
+        </w:rPr>
+      </w:pPr>
+      <w:r>
+        <w:rPr>
+          <w:noProof/>
+        </w:rPr>
+        <w:drawing>
+          <wp:inline distT="0" distB="0" distL="0" distR="0" wp14:anchorId="46CE8EF2" wp14:editId="0B0B29F0">
+            <wp:extent cx="2940685" cy="1626727"/>
+            <wp:effectExtent l="0" t="0" r="0" b="0"/>
+            <wp:docPr id="461651704" name="Picture 3" descr="0"/>
+            <wp:cNvGraphicFramePr>
+              <a:graphicFrameLocks xmlns:a="http://schemas.openxmlformats.org/drawingml/2006/main" noChangeAspect="1"/>
+            </wp:cNvGraphicFramePr>
+            <a:graphic xmlns:a="http://schemas.openxmlformats.org/drawingml/2006/main">
+              <a:graphicData uri="http://schemas.openxmlformats.org/drawingml/2006/picture">
+                <pic:pic xmlns:pic="http://schemas.openxmlformats.org/drawingml/2006/picture">
+                  <pic:nvPicPr>
+                    <pic:cNvPr id="0" name="Picture 5" descr="0"/>
+                    <pic:cNvPicPr>
+                      <a:picLocks noChangeAspect="1" noChangeArrowheads="1"/>
+                    </pic:cNvPicPr>
+                  </pic:nvPicPr>
+                  <pic:blipFill>
+                    <a:blip r:embed="rId21" cstate="print">
+                      <a:extLst>
+                        <a:ext uri="{28A0092B-C50C-407E-A947-70E740481C1C}">
+                          <a14:useLocalDpi xmlns:a14="http://schemas.microsoft.com/office/drawing/2010/main" val="0"/>
+                        </a:ext>
+                      </a:extLst>
+                    </a:blip>
+                    <a:srcRect/>
+                    <a:stretch>
+                      <a:fillRect/>
+                    </a:stretch>
+                  </pic:blipFill>
+                  <pic:spPr bwMode="auto">
+                    <a:xfrm>
+                      <a:off x="0" y="0"/>
+                      <a:ext cx="2948027" cy="1630788"/>
+                    </a:xfrm>
+                    <a:prstGeom prst="rect">
+                      <a:avLst/>
+                    </a:prstGeom>
+                    <a:noFill/>
+                    <a:ln>
+                      <a:noFill/>
+                    </a:ln>
+                  </pic:spPr>
+                </pic:pic>
+              </a:graphicData>
+            </a:graphic>
+          </wp:inline>
+        </w:drawing>
+      </w:r>
+    </w:p>
+    <w:p>
+      <w:pPr>
+        <w:rPr>
+          <w:lang w:val="fr-CH"/>
+        </w:rPr>
+      </w:pPr>
+    </w:p>
+    <w:p>
+      <w:pPr>
+        <w:rPr>
+          <w:lang w:val="fr-CH"/>
+        </w:rPr>
+      </w:pPr>
+      <w:r>
+        <w:rPr>
+          <w:lang w:val="fr-CH"/>
+        </w:rPr>
         <w:br w:type="page"/>
       </w:r>
     </w:p>
@@ -2337,7 +2959,7 @@
           <w:lang w:val="fr-CH"/>
         </w:rPr>
       </w:pPr>
-      <w:bookmarkStart w:id="2" w:name="_Toc225237387"/>
+      <w:bookmarkStart w:id="2" w:name="_Toc225797006"/>
       <w:r>
         <w:rPr>
           <w:lang w:val="fr-CH"/>
@@ -2456,25 +3078,7 @@
         <w:rPr>
           <w:lang w:val="fr-CH"/>
         </w:rPr>
-        <w:t>La température extérieure/degrés jours</w:t>
-      </w:r>
-      <w:r>
-        <w:rPr>
-          <w:lang w:val="fr-CH"/>
-        </w:rPr>
-        <w:t xml:space="preserve"> s</w:t>
-      </w:r>
-      <w:r>
-        <w:rPr>
-          <w:lang w:val="fr-CH"/>
-        </w:rPr>
-        <w:t>e recalcule des données météos locales</w:t>
-      </w:r>
-      <w:r>
-        <w:rPr>
-          <w:lang w:val="fr-CH"/>
-        </w:rPr>
-        <w:t xml:space="preserve"> </w:t>
+        <w:t xml:space="preserve">La température extérieure/degrés jours se recalcule des données météos locales </w:t>
       </w:r>
       <w:r>
         <w:rPr>
@@ -2559,13 +3163,7 @@
         <w:rPr>
           <w:lang w:val="fr-CH"/>
         </w:rPr>
-        <w:t>consommation d’électricité</w:t>
-      </w:r>
-      <w:r>
-        <w:rPr>
-          <w:lang w:val="fr-CH"/>
-        </w:rPr>
-        <w:t xml:space="preserve"> </w:t>
+        <w:t xml:space="preserve">consommation d’électricité </w:t>
       </w:r>
       <w:r>
         <w:rPr>
@@ -2619,7 +3217,7 @@
                     <pic:cNvPicPr/>
                   </pic:nvPicPr>
                   <pic:blipFill>
-                    <a:blip r:embed="rId19"/>
+                    <a:blip r:embed="rId22"/>
                     <a:stretch>
                       <a:fillRect/>
                     </a:stretch>
@@ -2667,7 +3265,7 @@
                     <pic:cNvPicPr/>
                   </pic:nvPicPr>
                   <pic:blipFill>
-                    <a:blip r:embed="rId20"/>
+                    <a:blip r:embed="rId23"/>
                     <a:stretch>
                       <a:fillRect/>
                     </a:stretch>
@@ -3242,19 +3840,12 @@
     </w:p>
     <w:p>
       <w:pPr>
-        <w:rPr>
-          <w:lang w:val="fr-CH"/>
-        </w:rPr>
-      </w:pPr>
-    </w:p>
-    <w:p>
-      <w:pPr>
         <w:pStyle w:val="Heading2"/>
         <w:rPr>
           <w:lang w:val="fr-CH"/>
         </w:rPr>
       </w:pPr>
-      <w:bookmarkStart w:id="3" w:name="_Toc225237388"/>
+      <w:bookmarkStart w:id="3" w:name="_Toc225797007"/>
       <w:r>
         <w:rPr>
           <w:lang w:val="fr-CH"/>
@@ -3293,7 +3884,7 @@
           <w:noProof/>
         </w:rPr>
         <w:drawing>
-          <wp:inline distT="0" distB="0" distL="0" distR="0" wp14:anchorId="0E75F1DA" wp14:editId="5EE96936">
+          <wp:inline distT="0" distB="0" distL="0" distR="0" wp14:anchorId="0E75F1DA" wp14:editId="54B04655">
             <wp:extent cx="5272088" cy="3423411"/>
             <wp:effectExtent l="0" t="0" r="5080" b="5715"/>
             <wp:docPr id="699267253" name="Picture 1" descr="0"/>
@@ -3310,7 +3901,7 @@
                     </pic:cNvPicPr>
                   </pic:nvPicPr>
                   <pic:blipFill>
-                    <a:blip r:embed="rId21" cstate="print">
+                    <a:blip r:embed="rId24" cstate="print">
                       <a:extLst>
                         <a:ext uri="{28A0092B-C50C-407E-A947-70E740481C1C}">
                           <a14:useLocalDpi xmlns:a14="http://schemas.microsoft.com/office/drawing/2010/main" val="0"/>
@@ -3354,7 +3945,7 @@
         </w:rPr>
         <w:lastRenderedPageBreak/>
         <w:drawing>
-          <wp:inline distT="0" distB="0" distL="0" distR="0" wp14:anchorId="7339B5DC" wp14:editId="66FEFAD3">
+          <wp:inline distT="0" distB="0" distL="0" distR="0" wp14:anchorId="7339B5DC" wp14:editId="12CCC50D">
             <wp:extent cx="5731510" cy="5719445"/>
             <wp:effectExtent l="0" t="0" r="2540" b="0"/>
             <wp:docPr id="1150075842" name="Picture 2" descr="0"/>
@@ -3371,7 +3962,7 @@
                     </pic:cNvPicPr>
                   </pic:nvPicPr>
                   <pic:blipFill>
-                    <a:blip r:embed="rId22" cstate="print">
+                    <a:blip r:embed="rId25" cstate="print">
                       <a:extLst>
                         <a:ext uri="{28A0092B-C50C-407E-A947-70E740481C1C}">
                           <a14:useLocalDpi xmlns:a14="http://schemas.microsoft.com/office/drawing/2010/main" val="0"/>
@@ -3415,7 +4006,7 @@
         </w:rPr>
         <w:lastRenderedPageBreak/>
         <w:drawing>
-          <wp:inline distT="0" distB="0" distL="0" distR="0" wp14:anchorId="6B06580F" wp14:editId="30B691AA">
+          <wp:inline distT="0" distB="0" distL="0" distR="0" wp14:anchorId="6B06580F" wp14:editId="69418D0B">
             <wp:extent cx="5731510" cy="5142865"/>
             <wp:effectExtent l="0" t="0" r="2540" b="635"/>
             <wp:docPr id="137569269" name="Picture 3" descr="0"/>
@@ -3432,7 +4023,7 @@
                     </pic:cNvPicPr>
                   </pic:nvPicPr>
                   <pic:blipFill>
-                    <a:blip r:embed="rId23" cstate="print">
+                    <a:blip r:embed="rId26" cstate="print">
                       <a:extLst>
                         <a:ext uri="{28A0092B-C50C-407E-A947-70E740481C1C}">
                           <a14:useLocalDpi xmlns:a14="http://schemas.microsoft.com/office/drawing/2010/main" val="0"/>
@@ -3549,7 +4140,7 @@
         </w:rPr>
         <w:lastRenderedPageBreak/>
         <w:drawing>
-          <wp:inline distT="0" distB="0" distL="0" distR="0" wp14:anchorId="11647A59" wp14:editId="1DCF31CF">
+          <wp:inline distT="0" distB="0" distL="0" distR="0" wp14:anchorId="11647A59" wp14:editId="106762AF">
             <wp:extent cx="5731510" cy="5142865"/>
             <wp:effectExtent l="0" t="0" r="2540" b="635"/>
             <wp:docPr id="2029346632" name="Picture 4" descr="0"/>
@@ -3566,7 +4157,7 @@
                     </pic:cNvPicPr>
                   </pic:nvPicPr>
                   <pic:blipFill>
-                    <a:blip r:embed="rId24" cstate="print">
+                    <a:blip r:embed="rId27" cstate="print">
                       <a:extLst>
                         <a:ext uri="{28A0092B-C50C-407E-A947-70E740481C1C}">
                           <a14:useLocalDpi xmlns:a14="http://schemas.microsoft.com/office/drawing/2010/main" val="0"/>
@@ -3634,7 +4225,21 @@
         <w:rPr>
           <w:lang w:val="fr-CH"/>
         </w:rPr>
-        <w:t>Il est possible de soustraire l’énergie moyenne avec le nombre de km annuel si il y a une voiture élec :</w:t>
+        <w:t xml:space="preserve">Il est possible de soustraire l’énergie moyenne avec le nombre de km annuel </w:t>
+      </w:r>
+      <w:proofErr w:type="gramStart"/>
+      <w:r>
+        <w:rPr>
+          <w:lang w:val="fr-CH"/>
+        </w:rPr>
+        <w:t>si il</w:t>
+      </w:r>
+      <w:proofErr w:type="gramEnd"/>
+      <w:r>
+        <w:rPr>
+          <w:lang w:val="fr-CH"/>
+        </w:rPr>
+        <w:t xml:space="preserve"> y a une voiture élec :</w:t>
       </w:r>
     </w:p>
     <w:tbl>
@@ -3812,25 +4417,7 @@
                 <w:sz w:val="22"/>
                 <w:szCs w:val="22"/>
               </w:rPr>
-              <w:t xml:space="preserve">: 7.57 kWh / jour </w:t>
-            </w:r>
-            <w:proofErr w:type="spellStart"/>
-            <w:r>
-              <w:rPr>
-                <w:rFonts w:ascii="Courier New" w:hAnsi="Courier New" w:cs="Courier New"/>
-                <w:sz w:val="22"/>
-                <w:szCs w:val="22"/>
-              </w:rPr>
-              <w:t>soit</w:t>
-            </w:r>
-            <w:proofErr w:type="spellEnd"/>
-            <w:r>
-              <w:rPr>
-                <w:rFonts w:ascii="Courier New" w:hAnsi="Courier New" w:cs="Courier New"/>
-                <w:sz w:val="22"/>
-                <w:szCs w:val="22"/>
-              </w:rPr>
-              <w:t xml:space="preserve"> </w:t>
+              <w:t xml:space="preserve">: 7.57 kWh / jour soit </w:t>
             </w:r>
             <w:proofErr w:type="spellStart"/>
             <w:r>
@@ -4010,25 +4597,7 @@
                 <w:sz w:val="22"/>
                 <w:szCs w:val="22"/>
               </w:rPr>
-              <w:t xml:space="preserve">: 3.46 kWh / jour </w:t>
-            </w:r>
-            <w:proofErr w:type="spellStart"/>
-            <w:r>
-              <w:rPr>
-                <w:rFonts w:ascii="Courier New" w:hAnsi="Courier New" w:cs="Courier New"/>
-                <w:sz w:val="22"/>
-                <w:szCs w:val="22"/>
-              </w:rPr>
-              <w:t>soit</w:t>
-            </w:r>
-            <w:proofErr w:type="spellEnd"/>
-            <w:r>
-              <w:rPr>
-                <w:rFonts w:ascii="Courier New" w:hAnsi="Courier New" w:cs="Courier New"/>
-                <w:sz w:val="22"/>
-                <w:szCs w:val="22"/>
-              </w:rPr>
-              <w:t xml:space="preserve"> </w:t>
+              <w:t xml:space="preserve">: 3.46 kWh / jour soit </w:t>
             </w:r>
             <w:proofErr w:type="spellStart"/>
             <w:r>
@@ -4071,6 +4640,124 @@
           <w:lang w:val="fr-CH"/>
         </w:rPr>
       </w:pPr>
+    </w:p>
+    <w:p>
+      <w:pPr>
+        <w:rPr>
+          <w:lang w:val="fr-CH"/>
+        </w:rPr>
+      </w:pPr>
+    </w:p>
+    <w:p>
+      <w:pPr>
+        <w:pStyle w:val="Heading2"/>
+        <w:rPr>
+          <w:lang w:val="fr-CH"/>
+        </w:rPr>
+      </w:pPr>
+      <w:bookmarkStart w:id="4" w:name="_Toc225797008"/>
+      <w:r>
+        <w:rPr>
+          <w:lang w:val="fr-CH"/>
+        </w:rPr>
+        <w:t>Exemple Perlas</w:t>
+      </w:r>
+      <w:bookmarkEnd w:id="4"/>
+    </w:p>
+    <w:p>
+      <w:pPr>
+        <w:rPr>
+          <w:lang w:val="fr-CH"/>
+        </w:rPr>
+      </w:pPr>
+      <w:r>
+        <w:rPr>
+          <w:lang w:val="fr-CH"/>
+        </w:rPr>
+        <w:t>De perlas.ch</w:t>
+      </w:r>
+    </w:p>
+    <w:p>
+      <w:pPr>
+        <w:rPr>
+          <w:lang w:val="fr-CH"/>
+        </w:rPr>
+      </w:pPr>
+      <w:r>
+        <w:rPr>
+          <w:noProof/>
+          <w:lang w:val="fr-CH"/>
+        </w:rPr>
+        <w:drawing>
+          <wp:inline distT="0" distB="0" distL="0" distR="0" wp14:anchorId="6DE5FD3F" wp14:editId="2B314C27">
+            <wp:extent cx="5731510" cy="2536825"/>
+            <wp:effectExtent l="0" t="0" r="2540" b="0"/>
+            <wp:docPr id="22115377" name="Picture 1" descr="The image displays a visual representation of energy consumption levels, comparing a user's current weekly consumption to different categories (A-F) based on historical data.&#10;&#10;AI-generated content may be incorrect."/>
+            <wp:cNvGraphicFramePr>
+              <a:graphicFrameLocks xmlns:a="http://schemas.openxmlformats.org/drawingml/2006/main" noChangeAspect="1"/>
+            </wp:cNvGraphicFramePr>
+            <a:graphic xmlns:a="http://schemas.openxmlformats.org/drawingml/2006/main">
+              <a:graphicData uri="http://schemas.openxmlformats.org/drawingml/2006/picture">
+                <pic:pic xmlns:pic="http://schemas.openxmlformats.org/drawingml/2006/picture">
+                  <pic:nvPicPr>
+                    <pic:cNvPr id="22115377" name="Picture 1" descr="The image displays a visual representation of energy consumption levels, comparing a user's current weekly consumption to different categories (A-F) based on historical data.&#10;&#10;AI-generated content may be incorrect."/>
+                    <pic:cNvPicPr/>
+                  </pic:nvPicPr>
+                  <pic:blipFill>
+                    <a:blip r:embed="rId28"/>
+                    <a:stretch>
+                      <a:fillRect/>
+                    </a:stretch>
+                  </pic:blipFill>
+                  <pic:spPr>
+                    <a:xfrm>
+                      <a:off x="0" y="0"/>
+                      <a:ext cx="5731510" cy="2536825"/>
+                    </a:xfrm>
+                    <a:prstGeom prst="rect">
+                      <a:avLst/>
+                    </a:prstGeom>
+                  </pic:spPr>
+                </pic:pic>
+              </a:graphicData>
+            </a:graphic>
+          </wp:inline>
+        </w:drawing>
+      </w:r>
+    </w:p>
+    <w:p>
+      <w:pPr>
+        <w:rPr>
+          <w:lang w:val="fr-CH"/>
+        </w:rPr>
+      </w:pPr>
+      <w:r>
+        <w:rPr>
+          <w:lang w:val="fr-CH"/>
+        </w:rPr>
+        <w:t>La surface et le nombre d’habitant doivent être entrés dans le système.</w:t>
+      </w:r>
+    </w:p>
+    <w:p>
+      <w:pPr>
+        <w:rPr>
+          <w:lang w:val="fr-CH"/>
+        </w:rPr>
+      </w:pPr>
+    </w:p>
+    <w:p>
+      <w:pPr>
+        <w:rPr>
+          <w:lang w:val="fr-CH"/>
+        </w:rPr>
+      </w:pPr>
+    </w:p>
+    <w:p>
+      <w:pPr>
+        <w:rPr>
+          <w:lang w:val="fr-CH"/>
+        </w:rPr>
+      </w:pPr>
       <w:r>
         <w:rPr>
           <w:lang w:val="fr-CH"/>
@@ -4085,7 +4772,7 @@
           <w:lang w:val="fr-CH"/>
         </w:rPr>
       </w:pPr>
-      <w:bookmarkStart w:id="4" w:name="_Toc225237389"/>
+      <w:bookmarkStart w:id="5" w:name="_Toc225797009"/>
       <w:r>
         <w:rPr>
           <w:lang w:val="fr-CH"/>
@@ -4107,7 +4794,7 @@
         </w:rPr>
         <w:t xml:space="preserve"> Friendly</w:t>
       </w:r>
-      <w:bookmarkEnd w:id="4"/>
+      <w:bookmarkEnd w:id="5"/>
     </w:p>
     <w:p>
       <w:pPr>
@@ -4179,11 +4866,19 @@
           <w:lang w:val="fr-CH"/>
         </w:rPr>
       </w:pPr>
-      <w:r>
-        <w:rPr>
-          <w:lang w:val="fr-CH"/>
-        </w:rPr>
-        <w:t>énergie consommée sur la période (en kWh) / puissance maximale appelée (en kW) en heure</w:t>
+      <w:proofErr w:type="gramStart"/>
+      <w:r>
+        <w:rPr>
+          <w:lang w:val="fr-CH"/>
+        </w:rPr>
+        <w:t>énergie</w:t>
+      </w:r>
+      <w:proofErr w:type="gramEnd"/>
+      <w:r>
+        <w:rPr>
+          <w:lang w:val="fr-CH"/>
+        </w:rPr>
+        <w:t xml:space="preserve"> consommée sur la période (en kWh) / puissance maximale appelée (en kW) en heure</w:t>
       </w:r>
     </w:p>
     <w:p>
@@ -4274,7 +4969,7 @@
       <w:pPr>
         <w:pStyle w:val="ListParagraph"/>
         <w:numPr>
-          <w:ilvl w:val="1"/>
+          <w:ilvl w:val="2"/>
           <w:numId w:val="6"/>
         </w:numPr>
         <w:rPr>
@@ -4285,7 +4980,13 @@
         <w:rPr>
           <w:lang w:val="fr-CH"/>
         </w:rPr>
-        <w:t>Quel pourcentage de la charge est durant les heures chères ou non.</w:t>
+        <w:t>Quel pourcentage de la charge est durant les heures chères ou non</w:t>
+      </w:r>
+      <w:r>
+        <w:rPr>
+          <w:lang w:val="fr-CH"/>
+        </w:rPr>
+        <w:t> ?</w:t>
       </w:r>
     </w:p>
     <w:p>
@@ -4359,6 +5060,59 @@
           <w:lang w:val="fr-CH"/>
         </w:rPr>
       </w:pPr>
+      <w:r>
+        <w:rPr>
+          <w:noProof/>
+        </w:rPr>
+        <w:drawing>
+          <wp:inline distT="0" distB="0" distL="0" distR="0" wp14:anchorId="6B0FAD09" wp14:editId="67B47131">
+            <wp:extent cx="5731510" cy="2830195"/>
+            <wp:effectExtent l="0" t="0" r="2540" b="8255"/>
+            <wp:docPr id="1237912317" name="Picture 1" descr="0"/>
+            <wp:cNvGraphicFramePr>
+              <a:graphicFrameLocks xmlns:a="http://schemas.openxmlformats.org/drawingml/2006/main" noChangeAspect="1"/>
+            </wp:cNvGraphicFramePr>
+            <a:graphic xmlns:a="http://schemas.openxmlformats.org/drawingml/2006/main">
+              <a:graphicData uri="http://schemas.openxmlformats.org/drawingml/2006/picture">
+                <pic:pic xmlns:pic="http://schemas.openxmlformats.org/drawingml/2006/picture">
+                  <pic:nvPicPr>
+                    <pic:cNvPr id="0" name="Picture 1" descr="0"/>
+                    <pic:cNvPicPr>
+                      <a:picLocks noChangeAspect="1" noChangeArrowheads="1"/>
+                    </pic:cNvPicPr>
+                  </pic:nvPicPr>
+                  <pic:blipFill>
+                    <a:blip r:embed="rId29" cstate="print">
+                      <a:extLst>
+                        <a:ext uri="{28A0092B-C50C-407E-A947-70E740481C1C}">
+                          <a14:useLocalDpi xmlns:a14="http://schemas.microsoft.com/office/drawing/2010/main" val="0"/>
+                        </a:ext>
+                      </a:extLst>
+                    </a:blip>
+                    <a:srcRect/>
+                    <a:stretch>
+                      <a:fillRect/>
+                    </a:stretch>
+                  </pic:blipFill>
+                  <pic:spPr bwMode="auto">
+                    <a:xfrm>
+                      <a:off x="0" y="0"/>
+                      <a:ext cx="5731510" cy="2830195"/>
+                    </a:xfrm>
+                    <a:prstGeom prst="rect">
+                      <a:avLst/>
+                    </a:prstGeom>
+                    <a:noFill/>
+                    <a:ln>
+                      <a:noFill/>
+                    </a:ln>
+                  </pic:spPr>
+                </pic:pic>
+              </a:graphicData>
+            </a:graphic>
+          </wp:inline>
+        </w:drawing>
+      </w:r>
     </w:p>
     <w:p>
       <w:pPr>
@@ -4374,11 +5128,12 @@
           <w:lang w:val="fr-CH"/>
         </w:rPr>
       </w:pPr>
-      <w:bookmarkStart w:id="5" w:name="_Toc225237390"/>
-      <w:r>
-        <w:rPr>
-          <w:lang w:val="fr-CH"/>
-        </w:rPr>
+      <w:bookmarkStart w:id="6" w:name="_Toc225797010"/>
+      <w:r>
+        <w:rPr>
+          <w:lang w:val="fr-CH"/>
+        </w:rPr>
+        <w:lastRenderedPageBreak/>
         <w:t>Répartition nuit-jour</w:t>
       </w:r>
       <w:r>
@@ -4387,7 +5142,7 @@
         </w:rPr>
         <w:t xml:space="preserve"> et semaine</w:t>
       </w:r>
-      <w:bookmarkEnd w:id="5"/>
+      <w:bookmarkEnd w:id="6"/>
     </w:p>
     <w:p>
       <w:pPr>
@@ -4416,7 +5171,7 @@
                     <pic:cNvPicPr/>
                   </pic:nvPicPr>
                   <pic:blipFill>
-                    <a:blip r:embed="rId25"/>
+                    <a:blip r:embed="rId30"/>
                     <a:stretch>
                       <a:fillRect/>
                     </a:stretch>
@@ -4448,7 +5203,6 @@
           <w:noProof/>
           <w:lang w:val="fr-CH"/>
         </w:rPr>
-        <w:lastRenderedPageBreak/>
         <w:drawing>
           <wp:inline distT="0" distB="0" distL="0" distR="0" wp14:anchorId="7FCAEE33" wp14:editId="46E4DEC4">
             <wp:extent cx="5731510" cy="3129915"/>
@@ -4465,7 +5219,7 @@
                     <pic:cNvPicPr/>
                   </pic:nvPicPr>
                   <pic:blipFill>
-                    <a:blip r:embed="rId26"/>
+                    <a:blip r:embed="rId31"/>
                     <a:stretch>
                       <a:fillRect/>
                     </a:stretch>
@@ -4496,8 +5250,9 @@
         <w:rPr>
           <w:noProof/>
         </w:rPr>
+        <w:lastRenderedPageBreak/>
         <w:drawing>
-          <wp:inline distT="0" distB="0" distL="0" distR="0" wp14:anchorId="669491AD" wp14:editId="73A1B5FA">
+          <wp:inline distT="0" distB="0" distL="0" distR="0" wp14:anchorId="669491AD" wp14:editId="48CFD1E7">
             <wp:extent cx="5731510" cy="3144520"/>
             <wp:effectExtent l="0" t="0" r="2540" b="0"/>
             <wp:docPr id="1832858824" name="Picture 6" descr="0"/>
@@ -4514,7 +5269,7 @@
                     </pic:cNvPicPr>
                   </pic:nvPicPr>
                   <pic:blipFill>
-                    <a:blip r:embed="rId27" cstate="print">
+                    <a:blip r:embed="rId32" cstate="print">
                       <a:extLst>
                         <a:ext uri="{28A0092B-C50C-407E-A947-70E740481C1C}">
                           <a14:useLocalDpi xmlns:a14="http://schemas.microsoft.com/office/drawing/2010/main" val="0"/>
@@ -4560,7 +5315,7 @@
       </w:r>
     </w:p>
     <w:sectPr>
-      <w:footerReference w:type="default" r:id="rId28"/>
+      <w:footerReference w:type="default" r:id="rId33"/>
       <w:pgSz w:w="11906" w:h="16838"/>
       <w:pgMar w:top="1276" w:right="1440" w:bottom="1440" w:left="1440" w:header="708" w:footer="708" w:gutter="0"/>
       <w:cols w:space="708"/>
@@ -4928,7 +5683,7 @@
         <w:rFonts w:ascii="Courier New" w:hAnsi="Courier New" w:cs="Courier New" w:hint="default"/>
       </w:rPr>
     </w:lvl>
-    <w:lvl w:ilvl="2" w:tplc="20000005" w:tentative="1">
+    <w:lvl w:ilvl="2" w:tplc="20000005">
       <w:start w:val="1"/>
       <w:numFmt w:val="bullet"/>
       <w:lvlText w:val=""/>
@@ -5848,7 +6603,6 @@
     <w:next w:val="Normal"/>
     <w:link w:val="Heading3Char"/>
     <w:uiPriority w:val="9"/>
-    <w:semiHidden/>
     <w:unhideWhenUsed/>
     <w:qFormat/>
     <w:rsid w:val="0050356C"/>
@@ -6028,7 +6782,6 @@
   <w:style w:type="character" w:default="1" w:styleId="DefaultParagraphFont">
     <w:name w:val="Default Paragraph Font"/>
     <w:uiPriority w:val="1"/>
-    <w:semiHidden/>
     <w:unhideWhenUsed/>
   </w:style>
   <w:style w:type="table" w:default="1" w:styleId="TableNormal">
@@ -6083,7 +6836,6 @@
     <w:basedOn w:val="DefaultParagraphFont"/>
     <w:link w:val="Heading3"/>
     <w:uiPriority w:val="9"/>
-    <w:semiHidden/>
     <w:rsid w:val="0050356C"/>
     <w:rPr>
       <w:rFonts w:eastAsiaTheme="majorEastAsia" w:cstheme="majorBidi"/>
@@ -6463,6 +7215,23 @@
       <w:ind w:left="240"/>
     </w:pPr>
   </w:style>
+  <w:style w:type="paragraph" w:styleId="NormalWeb">
+    <w:name w:val="Normal (Web)"/>
+    <w:basedOn w:val="Normal"/>
+    <w:uiPriority w:val="99"/>
+    <w:semiHidden/>
+    <w:unhideWhenUsed/>
+    <w:rsid w:val="00D47804"/>
+    <w:pPr>
+      <w:spacing w:before="100" w:beforeAutospacing="1" w:after="100" w:afterAutospacing="1" w:line="240" w:lineRule="auto"/>
+    </w:pPr>
+    <w:rPr>
+      <w:rFonts w:ascii="Times New Roman" w:eastAsia="Times New Roman" w:hAnsi="Times New Roman" w:cs="Times New Roman"/>
+      <w:kern w:val="0"/>
+      <w:lang w:val="en-CH" w:eastAsia="en-CH"/>
+      <w14:ligatures w14:val="none"/>
+    </w:rPr>
+  </w:style>
 </w:styles>
 </file>
 

</xml_diff>